<commit_message>
Se actualizo la planeacion de riesgos de la semana 3
Ahora contienen mas riesgos posibles, sus consecuencias, mitgacion y plan de accion por si ocuerre
</commit_message>
<xml_diff>
--- a/Planeacion/PlaneacionSemana3_Riesgos.docx
+++ b/Planeacion/PlaneacionSemana3_Riesgos.docx
@@ -112,6 +112,8 @@
         <w:jc w:val="both"/>
         <w:rPr>
           <w:rFonts w:ascii="Arial" w:hAnsi="Arial" w:cs="Arial"/>
+          <w:sz w:val="22"/>
+          <w:szCs w:val="22"/>
         </w:rPr>
       </w:pPr>
     </w:p>
@@ -362,23 +364,7 @@
                 <w:sz w:val="20"/>
                 <w:szCs w:val="20"/>
               </w:rPr>
-              <w:t>I</w:t>
-            </w:r>
-            <w:r>
-              <w:rPr>
-                <w:rFonts w:ascii="Arial" w:hAnsi="Arial" w:cs="Arial"/>
-                <w:sz w:val="20"/>
-                <w:szCs w:val="20"/>
-              </w:rPr>
-              <w:t>dentificar las tareas críticas (como la conexión a la DB) y realizarlas</w:t>
-            </w:r>
-            <w:r>
-              <w:rPr>
-                <w:rFonts w:ascii="Arial" w:hAnsi="Arial" w:cs="Arial"/>
-                <w:sz w:val="20"/>
-                <w:szCs w:val="20"/>
-              </w:rPr>
-              <w:t xml:space="preserve"> primero.</w:t>
+              <w:t>Identificar las tareas críticas (como la conexión a la DB) y realizarlas primero.</w:t>
             </w:r>
           </w:p>
         </w:tc>
@@ -403,15 +389,7 @@
                 <w:sz w:val="20"/>
                 <w:szCs w:val="20"/>
               </w:rPr>
-              <w:t>Reducir el alcance del módulo de coordinadores a una simple lista de visualización sin acciones complejas</w:t>
-            </w:r>
-            <w:r>
-              <w:rPr>
-                <w:rFonts w:ascii="Arial" w:hAnsi="Arial" w:cs="Arial"/>
-                <w:sz w:val="20"/>
-                <w:szCs w:val="20"/>
-              </w:rPr>
-              <w:t>.</w:t>
+              <w:t>Reducir el alcance del módulo de coordinadores a una simple lista de visualización sin acciones complejas.</w:t>
             </w:r>
           </w:p>
           <w:p>
@@ -501,23 +479,13 @@
                 <w:szCs w:val="20"/>
               </w:rPr>
             </w:pPr>
-            <w:proofErr w:type="spellStart"/>
-            <w:r>
-              <w:rPr>
-                <w:rFonts w:ascii="Arial" w:hAnsi="Arial" w:cs="Arial"/>
-                <w:sz w:val="20"/>
-                <w:szCs w:val="20"/>
-              </w:rPr>
-              <w:t>Re-trabajo</w:t>
-            </w:r>
-            <w:proofErr w:type="spellEnd"/>
-            <w:r>
-              <w:rPr>
-                <w:rFonts w:ascii="Arial" w:hAnsi="Arial" w:cs="Arial"/>
-                <w:sz w:val="20"/>
-                <w:szCs w:val="20"/>
-              </w:rPr>
-              <w:t xml:space="preserve"> constante al tener que modificar la base de datos y la interfaz varias veces.</w:t>
+            <w:r>
+              <w:rPr>
+                <w:rFonts w:ascii="Arial" w:hAnsi="Arial" w:cs="Arial"/>
+                <w:sz w:val="20"/>
+                <w:szCs w:val="20"/>
+              </w:rPr>
+              <w:t>Re-trabajo constante al tener que modificar la base de datos y la interfaz varias veces.</w:t>
             </w:r>
           </w:p>
         </w:tc>
@@ -922,17 +890,7 @@
                 <w:sz w:val="20"/>
                 <w:szCs w:val="20"/>
               </w:rPr>
-              <w:t>M</w:t>
-            </w:r>
-            <w:r>
-              <w:rPr>
-                <w:rFonts w:ascii="Arial" w:hAnsi="Arial" w:cs="Arial"/>
-                <w:b/>
-                <w:bCs/>
-                <w:sz w:val="20"/>
-                <w:szCs w:val="20"/>
-              </w:rPr>
-              <w:t xml:space="preserve">edio: </w:t>
+              <w:t xml:space="preserve">Medio: </w:t>
             </w:r>
           </w:p>
           <w:p>
@@ -1210,6 +1168,336 @@
                 <w:szCs w:val="20"/>
               </w:rPr>
               <w:t>Implementar un sistema que constantemente checa metadatos o al ingresar a una ventana cheque y cerrar la sesión para corregir el acceso del usuario si esta donde no debería.</w:t>
+            </w:r>
+          </w:p>
+        </w:tc>
+      </w:tr>
+      <w:tr>
+        <w:tc>
+          <w:tcPr>
+            <w:tcW w:w="2263" w:type="dxa"/>
+          </w:tcPr>
+          <w:p>
+            <w:pPr>
+              <w:spacing w:line="360" w:lineRule="auto"/>
+              <w:jc w:val="both"/>
+              <w:rPr>
+                <w:rFonts w:ascii="Arial" w:hAnsi="Arial" w:cs="Arial"/>
+                <w:b/>
+                <w:bCs/>
+                <w:sz w:val="20"/>
+                <w:szCs w:val="20"/>
+              </w:rPr>
+            </w:pPr>
+            <w:r>
+              <w:rPr>
+                <w:rFonts w:ascii="Arial" w:hAnsi="Arial" w:cs="Arial"/>
+                <w:b/>
+                <w:bCs/>
+                <w:sz w:val="20"/>
+                <w:szCs w:val="20"/>
+              </w:rPr>
+              <w:t>Fallos del servicio de alojamiento de repositorio (GitHub):</w:t>
+            </w:r>
+          </w:p>
+          <w:p>
+            <w:pPr>
+              <w:spacing w:line="360" w:lineRule="auto"/>
+              <w:jc w:val="both"/>
+              <w:rPr>
+                <w:rFonts w:ascii="Arial" w:hAnsi="Arial" w:cs="Arial"/>
+                <w:sz w:val="20"/>
+                <w:szCs w:val="20"/>
+              </w:rPr>
+            </w:pPr>
+            <w:r>
+              <w:rPr>
+                <w:rFonts w:ascii="Arial" w:hAnsi="Arial" w:cs="Arial"/>
+                <w:sz w:val="20"/>
+                <w:szCs w:val="20"/>
+              </w:rPr>
+              <w:t xml:space="preserve">El servicio de alojamiento de repositorio cae o tiene problemas para subir commits, o hacer push y pull. </w:t>
+            </w:r>
+          </w:p>
+          <w:p>
+            <w:pPr>
+              <w:spacing w:line="360" w:lineRule="auto"/>
+              <w:jc w:val="both"/>
+              <w:rPr>
+                <w:rFonts w:ascii="Arial" w:hAnsi="Arial" w:cs="Arial"/>
+                <w:b/>
+                <w:bCs/>
+                <w:sz w:val="20"/>
+                <w:szCs w:val="20"/>
+              </w:rPr>
+            </w:pPr>
+            <w:r>
+              <w:rPr>
+                <w:rFonts w:ascii="Arial" w:hAnsi="Arial" w:cs="Arial"/>
+                <w:b/>
+                <w:bCs/>
+                <w:sz w:val="20"/>
+                <w:szCs w:val="20"/>
+              </w:rPr>
+              <w:t xml:space="preserve"> </w:t>
+            </w:r>
+          </w:p>
+        </w:tc>
+        <w:tc>
+          <w:tcPr>
+            <w:tcW w:w="2242" w:type="dxa"/>
+          </w:tcPr>
+          <w:p>
+            <w:pPr>
+              <w:spacing w:line="360" w:lineRule="auto"/>
+              <w:jc w:val="both"/>
+              <w:rPr>
+                <w:rFonts w:ascii="Arial" w:hAnsi="Arial" w:cs="Arial"/>
+                <w:b/>
+                <w:bCs/>
+                <w:sz w:val="20"/>
+                <w:szCs w:val="20"/>
+              </w:rPr>
+            </w:pPr>
+            <w:r>
+              <w:rPr>
+                <w:rFonts w:ascii="Arial" w:hAnsi="Arial" w:cs="Arial"/>
+                <w:b/>
+                <w:bCs/>
+                <w:sz w:val="20"/>
+                <w:szCs w:val="20"/>
+              </w:rPr>
+              <w:t>Medio:</w:t>
+            </w:r>
+          </w:p>
+          <w:p>
+            <w:pPr>
+              <w:spacing w:line="360" w:lineRule="auto"/>
+              <w:jc w:val="both"/>
+              <w:rPr>
+                <w:rFonts w:ascii="Arial" w:hAnsi="Arial" w:cs="Arial"/>
+                <w:sz w:val="20"/>
+                <w:szCs w:val="20"/>
+              </w:rPr>
+            </w:pPr>
+            <w:r>
+              <w:rPr>
+                <w:rFonts w:ascii="Arial" w:hAnsi="Arial" w:cs="Arial"/>
+                <w:sz w:val="20"/>
+                <w:szCs w:val="20"/>
+              </w:rPr>
+              <w:t>No se podrá realizar commits y si se tiene que usar otro dispositivo para el trabajo o revertir a un commit anterior puede haber fallos.</w:t>
+            </w:r>
+          </w:p>
+        </w:tc>
+        <w:tc>
+          <w:tcPr>
+            <w:tcW w:w="2294" w:type="dxa"/>
+          </w:tcPr>
+          <w:p>
+            <w:pPr>
+              <w:spacing w:line="360" w:lineRule="auto"/>
+              <w:jc w:val="both"/>
+              <w:rPr>
+                <w:rFonts w:ascii="Arial" w:hAnsi="Arial" w:cs="Arial"/>
+                <w:sz w:val="20"/>
+                <w:szCs w:val="20"/>
+              </w:rPr>
+            </w:pPr>
+            <w:r>
+              <w:rPr>
+                <w:rFonts w:ascii="Arial" w:hAnsi="Arial" w:cs="Arial"/>
+                <w:sz w:val="20"/>
+                <w:szCs w:val="20"/>
+              </w:rPr>
+              <w:t>Utilizar otros medios para enviar archivos también y tener un repositorio local además del de la nube.</w:t>
+            </w:r>
+          </w:p>
+        </w:tc>
+        <w:tc>
+          <w:tcPr>
+            <w:tcW w:w="2551" w:type="dxa"/>
+          </w:tcPr>
+          <w:p>
+            <w:pPr>
+              <w:spacing w:line="360" w:lineRule="auto"/>
+              <w:jc w:val="both"/>
+              <w:rPr>
+                <w:rFonts w:ascii="Arial" w:hAnsi="Arial" w:cs="Arial"/>
+                <w:sz w:val="20"/>
+                <w:szCs w:val="20"/>
+              </w:rPr>
+            </w:pPr>
+            <w:r>
+              <w:rPr>
+                <w:rFonts w:ascii="Arial" w:hAnsi="Arial" w:cs="Arial"/>
+                <w:sz w:val="20"/>
+                <w:szCs w:val="20"/>
+              </w:rPr>
+              <w:t>Utilizar otra herramienta como GitLab o Bitbucket, además también se puede crear un servidor propio de repositorios usando Gitea.</w:t>
+            </w:r>
+          </w:p>
+        </w:tc>
+      </w:tr>
+      <w:tr>
+        <w:tc>
+          <w:tcPr>
+            <w:tcW w:w="2263" w:type="dxa"/>
+          </w:tcPr>
+          <w:p>
+            <w:pPr>
+              <w:spacing w:line="360" w:lineRule="auto"/>
+              <w:jc w:val="both"/>
+              <w:rPr>
+                <w:rFonts w:ascii="Arial" w:hAnsi="Arial" w:cs="Arial"/>
+                <w:b/>
+                <w:bCs/>
+                <w:sz w:val="20"/>
+                <w:szCs w:val="20"/>
+              </w:rPr>
+            </w:pPr>
+            <w:r>
+              <w:rPr>
+                <w:rFonts w:ascii="Arial" w:hAnsi="Arial" w:cs="Arial"/>
+                <w:b/>
+                <w:bCs/>
+                <w:sz w:val="20"/>
+                <w:szCs w:val="20"/>
+              </w:rPr>
+              <w:t>Fallo físico del hardware:</w:t>
+            </w:r>
+          </w:p>
+          <w:p>
+            <w:pPr>
+              <w:spacing w:line="360" w:lineRule="auto"/>
+              <w:jc w:val="both"/>
+              <w:rPr>
+                <w:rFonts w:ascii="Arial" w:hAnsi="Arial" w:cs="Arial"/>
+                <w:sz w:val="20"/>
+                <w:szCs w:val="20"/>
+              </w:rPr>
+            </w:pPr>
+            <w:r>
+              <w:rPr>
+                <w:rFonts w:ascii="Arial" w:hAnsi="Arial" w:cs="Arial"/>
+                <w:sz w:val="20"/>
+                <w:szCs w:val="20"/>
+              </w:rPr>
+              <w:t>El hardware que se utiliza para desarrollar el proyecto puede tener fallos o averiarse completamente.</w:t>
+            </w:r>
+          </w:p>
+          <w:p>
+            <w:pPr>
+              <w:spacing w:line="360" w:lineRule="auto"/>
+              <w:jc w:val="both"/>
+              <w:rPr>
+                <w:rFonts w:ascii="Arial" w:hAnsi="Arial" w:cs="Arial"/>
+                <w:sz w:val="20"/>
+                <w:szCs w:val="20"/>
+              </w:rPr>
+            </w:pPr>
+          </w:p>
+        </w:tc>
+        <w:tc>
+          <w:tcPr>
+            <w:tcW w:w="2242" w:type="dxa"/>
+          </w:tcPr>
+          <w:p>
+            <w:pPr>
+              <w:spacing w:line="360" w:lineRule="auto"/>
+              <w:jc w:val="both"/>
+              <w:rPr>
+                <w:rFonts w:ascii="Arial" w:hAnsi="Arial" w:cs="Arial"/>
+                <w:b/>
+                <w:bCs/>
+                <w:sz w:val="20"/>
+                <w:szCs w:val="20"/>
+              </w:rPr>
+            </w:pPr>
+            <w:r>
+              <w:rPr>
+                <w:rFonts w:ascii="Arial" w:hAnsi="Arial" w:cs="Arial"/>
+                <w:b/>
+                <w:bCs/>
+                <w:sz w:val="20"/>
+                <w:szCs w:val="20"/>
+              </w:rPr>
+              <w:t>Alto:</w:t>
+            </w:r>
+          </w:p>
+          <w:p>
+            <w:pPr>
+              <w:spacing w:line="360" w:lineRule="auto"/>
+              <w:jc w:val="both"/>
+              <w:rPr>
+                <w:rFonts w:ascii="Arial" w:hAnsi="Arial" w:cs="Arial"/>
+                <w:sz w:val="20"/>
+                <w:szCs w:val="20"/>
+              </w:rPr>
+            </w:pPr>
+            <w:r>
+              <w:rPr>
+                <w:rFonts w:ascii="Arial" w:hAnsi="Arial" w:cs="Arial"/>
+                <w:sz w:val="20"/>
+                <w:szCs w:val="20"/>
+              </w:rPr>
+              <w:t>Si el dispositivo que se usa para desarrollar el proyecto se avería puede causar muchos retrasos.</w:t>
+            </w:r>
+          </w:p>
+        </w:tc>
+        <w:tc>
+          <w:tcPr>
+            <w:tcW w:w="2294" w:type="dxa"/>
+          </w:tcPr>
+          <w:p>
+            <w:pPr>
+              <w:spacing w:line="360" w:lineRule="auto"/>
+              <w:jc w:val="both"/>
+              <w:rPr>
+                <w:rFonts w:ascii="Arial" w:hAnsi="Arial" w:cs="Arial"/>
+                <w:sz w:val="20"/>
+                <w:szCs w:val="20"/>
+              </w:rPr>
+            </w:pPr>
+            <w:r>
+              <w:rPr>
+                <w:rFonts w:ascii="Arial" w:hAnsi="Arial" w:cs="Arial"/>
+                <w:sz w:val="20"/>
+                <w:szCs w:val="20"/>
+              </w:rPr>
+              <w:t>Contar con otros dispositivos que cuentan con lo necesario para continuar el desarrollo del proyecto.</w:t>
+            </w:r>
+          </w:p>
+        </w:tc>
+        <w:tc>
+          <w:tcPr>
+            <w:tcW w:w="2551" w:type="dxa"/>
+          </w:tcPr>
+          <w:p>
+            <w:pPr>
+              <w:spacing w:line="360" w:lineRule="auto"/>
+              <w:jc w:val="both"/>
+              <w:rPr>
+                <w:rFonts w:ascii="Arial" w:hAnsi="Arial" w:cs="Arial"/>
+                <w:sz w:val="20"/>
+                <w:szCs w:val="20"/>
+              </w:rPr>
+            </w:pPr>
+            <w:r>
+              <w:rPr>
+                <w:rFonts w:ascii="Arial" w:hAnsi="Arial" w:cs="Arial"/>
+                <w:sz w:val="20"/>
+                <w:szCs w:val="20"/>
+              </w:rPr>
+              <w:t xml:space="preserve">Utilizar otro dispositivo para continuar con el desarrollo utilizando el repositorio para </w:t>
+            </w:r>
+            <w:r>
+              <w:rPr>
+                <w:rFonts w:ascii="Arial" w:hAnsi="Arial" w:cs="Arial"/>
+                <w:sz w:val="20"/>
+                <w:szCs w:val="20"/>
+              </w:rPr>
+              <w:t>recuperar el progreso.</w:t>
             </w:r>
           </w:p>
         </w:tc>
@@ -3178,6 +3466,7 @@
   <w:style w:type="character" w:default="1" w:styleId="Fuentedeprrafopredeter">
     <w:name w:val="Default Paragraph Font"/>
     <w:uiPriority w:val="1"/>
+    <w:semiHidden/>
     <w:unhideWhenUsed/>
   </w:style>
   <w:style w:type="table" w:default="1" w:styleId="Tablanormal">

</xml_diff>